<commit_message>
end of lesson commit
</commit_message>
<xml_diff>
--- a/Ethan Van Der Heijden Testing.docx
+++ b/Ethan Van Der Heijden Testing.docx
@@ -446,7 +446,7 @@
               <w:rPr>
                 <w:rtl w:val="0"/>
               </w:rPr>
-              <w:t xml:space="preserve">Added in an if line to check if the user accepted the meal popup and then updating the single item and turning the text into a different text saying its in a meal</w:t>
+              <w:t xml:space="preserve">Added an if line to check if the user accepted the meal popup and then update the single item and turning the text into a different text saying its in a meal</w:t>
             </w:r>
           </w:p>
         </w:tc>
@@ -605,12 +605,12 @@
                 <wp:inline distB="114300" distT="114300" distL="114300" distR="114300">
                   <wp:extent cx="2419350" cy="523875"/>
                   <wp:effectExtent b="0" l="0" r="0" t="0"/>
-                  <wp:docPr id="2" name="image3.png"/>
+                  <wp:docPr id="1" name="image2.png"/>
                   <a:graphic>
                     <a:graphicData uri="http://schemas.openxmlformats.org/drawingml/2006/picture">
                       <pic:pic>
                         <pic:nvPicPr>
-                          <pic:cNvPr id="0" name="image3.png"/>
+                          <pic:cNvPr id="0" name="image2.png"/>
                           <pic:cNvPicPr preferRelativeResize="0"/>
                         </pic:nvPicPr>
                         <pic:blipFill>
@@ -897,39 +897,36 @@
               <w:rPr>
                 <w:rtl w:val="0"/>
               </w:rPr>
-              <w:t xml:space="preserve">Click “Add meal to cart”</w:t>
-            </w:r>
-          </w:p>
-        </w:tc>
-        <w:tc>
-          <w:tcPr>
-            <w:vAlign w:val="center"/>
-          </w:tcPr>
-          <w:p>
-            <w:pPr>
-              <w:rPr/>
-            </w:pPr>
-            <w:r>
-              <w:rPr>
-                <w:rtl w:val="0"/>
-              </w:rPr>
-              <w:t xml:space="preserve">The item is displayed on the checkout page as a meal</w:t>
-            </w:r>
-          </w:p>
-        </w:tc>
-        <w:tc>
-          <w:tcPr>
-            <w:vAlign w:val="center"/>
-          </w:tcPr>
-          <w:p>
-            <w:pPr>
-              <w:rPr/>
-            </w:pPr>
-            <w:r>
-              <w:rPr>
-                <w:rtl w:val="0"/>
-              </w:rPr>
-              <w:t xml:space="preserve">The item is displayed on the checkout page as a meal</w:t>
+            </w:r>
+          </w:p>
+        </w:tc>
+        <w:tc>
+          <w:tcPr>
+            <w:vAlign w:val="center"/>
+          </w:tcPr>
+          <w:p>
+            <w:pPr>
+              <w:rPr/>
+            </w:pPr>
+            <w:r>
+              <w:rPr>
+                <w:rtl w:val="0"/>
+              </w:rPr>
+            </w:r>
+          </w:p>
+        </w:tc>
+        <w:tc>
+          <w:tcPr>
+            <w:vAlign w:val="center"/>
+          </w:tcPr>
+          <w:p>
+            <w:pPr>
+              <w:rPr/>
+            </w:pPr>
+            <w:r>
+              <w:rPr>
+                <w:rtl w:val="0"/>
+              </w:rPr>
             </w:r>
           </w:p>
         </w:tc>
@@ -1161,41 +1158,6 @@
             <w:pPr>
               <w:rPr/>
             </w:pPr>
-            <w:r>
-              <w:rPr/>
-              <w:drawing>
-                <wp:inline distB="114300" distT="114300" distL="114300" distR="114300">
-                  <wp:extent cx="5076825" cy="781050"/>
-                  <wp:effectExtent b="0" l="0" r="0" t="0"/>
-                  <wp:docPr id="3" name="image2.png"/>
-                  <a:graphic>
-                    <a:graphicData uri="http://schemas.openxmlformats.org/drawingml/2006/picture">
-                      <pic:pic>
-                        <pic:nvPicPr>
-                          <pic:cNvPr id="0" name="image2.png"/>
-                          <pic:cNvPicPr preferRelativeResize="0"/>
-                        </pic:nvPicPr>
-                        <pic:blipFill>
-                          <a:blip r:embed="rId8"/>
-                          <a:srcRect b="0" l="0" r="0" t="0"/>
-                          <a:stretch>
-                            <a:fillRect/>
-                          </a:stretch>
-                        </pic:blipFill>
-                        <pic:spPr>
-                          <a:xfrm>
-                            <a:off x="0" y="0"/>
-                            <a:ext cx="5076825" cy="781050"/>
-                          </a:xfrm>
-                          <a:prstGeom prst="rect"/>
-                          <a:ln/>
-                        </pic:spPr>
-                      </pic:pic>
-                    </a:graphicData>
-                  </a:graphic>
-                </wp:inline>
-              </w:drawing>
-            </w:r>
             <w:r>
               <w:rPr>
                 <w:rtl w:val="0"/>
@@ -1485,23 +1447,23 @@
               <w:rPr>
                 <w:rtl w:val="0"/>
               </w:rPr>
-              <w:t xml:space="preserve">Login</w:t>
-            </w:r>
-          </w:p>
-        </w:tc>
-        <w:tc>
-          <w:tcPr>
-            <w:vAlign w:val="center"/>
-          </w:tcPr>
-          <w:p>
-            <w:pPr>
-              <w:rPr/>
-            </w:pPr>
-            <w:r>
-              <w:rPr>
-                <w:rtl w:val="0"/>
-              </w:rPr>
-              <w:t xml:space="preserve">The user should login into their account after “registering” one</w:t>
+              <w:t xml:space="preserve">Email Registry</w:t>
+            </w:r>
+          </w:p>
+        </w:tc>
+        <w:tc>
+          <w:tcPr>
+            <w:vAlign w:val="center"/>
+          </w:tcPr>
+          <w:p>
+            <w:pPr>
+              <w:rPr/>
+            </w:pPr>
+            <w:r>
+              <w:rPr>
+                <w:rtl w:val="0"/>
+              </w:rPr>
+              <w:t xml:space="preserve">The user should be able to type their email into the system while registering, and it will detect wether or not the email is valid. </w:t>
             </w:r>
           </w:p>
         </w:tc>
@@ -1699,7 +1661,7 @@
               <w:rPr>
                 <w:rtl w:val="0"/>
               </w:rPr>
-              <w:t xml:space="preserve">Using the same email that was used to register</w:t>
+              <w:t xml:space="preserve">test@gmail.com</w:t>
             </w:r>
           </w:p>
         </w:tc>
@@ -1731,23 +1693,23 @@
               <w:rPr>
                 <w:rtl w:val="0"/>
               </w:rPr>
-              <w:t xml:space="preserve">The Correct details will allow the user to log in</w:t>
-            </w:r>
-          </w:p>
-        </w:tc>
-        <w:tc>
-          <w:tcPr>
-            <w:vAlign w:val="center"/>
-          </w:tcPr>
-          <w:p>
-            <w:pPr>
-              <w:rPr/>
-            </w:pPr>
-            <w:r>
-              <w:rPr>
-                <w:rtl w:val="0"/>
-              </w:rPr>
-              <w:t xml:space="preserve">The user logs in</w:t>
+              <w:t xml:space="preserve">The user passes and is taken to the login screen</w:t>
+            </w:r>
+          </w:p>
+        </w:tc>
+        <w:tc>
+          <w:tcPr>
+            <w:vAlign w:val="center"/>
+          </w:tcPr>
+          <w:p>
+            <w:pPr>
+              <w:rPr/>
+            </w:pPr>
+            <w:r>
+              <w:rPr>
+                <w:rtl w:val="0"/>
+              </w:rPr>
+              <w:t xml:space="preserve">The user passes and is put into the login screen</w:t>
             </w:r>
           </w:p>
         </w:tc>
@@ -1785,7 +1747,7 @@
               <w:rPr>
                 <w:rtl w:val="0"/>
               </w:rPr>
-              <w:t xml:space="preserve">Using an Email with caps enabled, eg, using “Email” and not “email”</w:t>
+              <w:t xml:space="preserve">test@Gmail.com</w:t>
             </w:r>
           </w:p>
         </w:tc>
@@ -1817,38 +1779,39 @@
               <w:rPr>
                 <w:rtl w:val="0"/>
               </w:rPr>
-              <w:t xml:space="preserve">The capital letter will not allow the user to log in</w:t>
-            </w:r>
-          </w:p>
-        </w:tc>
-        <w:tc>
-          <w:tcPr>
-            <w:vAlign w:val="center"/>
-          </w:tcPr>
-          <w:p>
-            <w:pPr>
-              <w:rPr/>
-            </w:pPr>
-            <w:r>
-              <w:rPr>
-                <w:rtl w:val="0"/>
-              </w:rPr>
-              <w:t xml:space="preserve">The capital letter will not allow the user to log in</w:t>
-            </w:r>
-          </w:p>
-        </w:tc>
-        <w:tc>
-          <w:tcPr>
-            <w:vAlign w:val="center"/>
-          </w:tcPr>
-          <w:p>
-            <w:pPr>
-              <w:rPr/>
-            </w:pPr>
-            <w:r>
-              <w:rPr>
-                <w:rtl w:val="0"/>
-              </w:rPr>
+              <w:t xml:space="preserve">The user gets stopped, and an error shows up saying that there is something wrong with the input email.</w:t>
+            </w:r>
+          </w:p>
+        </w:tc>
+        <w:tc>
+          <w:tcPr>
+            <w:vAlign w:val="center"/>
+          </w:tcPr>
+          <w:p>
+            <w:pPr>
+              <w:rPr/>
+            </w:pPr>
+            <w:r>
+              <w:rPr>
+                <w:rtl w:val="0"/>
+              </w:rPr>
+              <w:t xml:space="preserve">The error does not show up, but the user is stopped.</w:t>
+            </w:r>
+          </w:p>
+        </w:tc>
+        <w:tc>
+          <w:tcPr>
+            <w:vAlign w:val="center"/>
+          </w:tcPr>
+          <w:p>
+            <w:pPr>
+              <w:rPr/>
+            </w:pPr>
+            <w:r>
+              <w:rPr>
+                <w:rtl w:val="0"/>
+              </w:rPr>
+              <w:t xml:space="preserve">Changed a line of code to make the error message show when the user's email is invalid.</w:t>
             </w:r>
           </w:p>
         </w:tc>
@@ -1871,7 +1834,7 @@
               <w:rPr>
                 <w:rtl w:val="0"/>
               </w:rPr>
-              <w:t xml:space="preserve">Switching the email and password while logging in</w:t>
+              <w:t xml:space="preserve">username</w:t>
             </w:r>
           </w:p>
         </w:tc>
@@ -1903,23 +1866,23 @@
               <w:rPr>
                 <w:rtl w:val="0"/>
               </w:rPr>
-              <w:t xml:space="preserve">The switched details will not let the user log in</w:t>
-            </w:r>
-          </w:p>
-        </w:tc>
-        <w:tc>
-          <w:tcPr>
-            <w:vAlign w:val="center"/>
-          </w:tcPr>
-          <w:p>
-            <w:pPr>
-              <w:rPr/>
-            </w:pPr>
-            <w:r>
-              <w:rPr>
-                <w:rtl w:val="0"/>
-              </w:rPr>
-              <w:t xml:space="preserve">The switched details will not let the user log in</w:t>
+              <w:t xml:space="preserve">The user gets stopped, and an error shows up saying that there is something wrong with the input email.</w:t>
+            </w:r>
+          </w:p>
+        </w:tc>
+        <w:tc>
+          <w:tcPr>
+            <w:vAlign w:val="center"/>
+          </w:tcPr>
+          <w:p>
+            <w:pPr>
+              <w:rPr/>
+            </w:pPr>
+            <w:r>
+              <w:rPr>
+                <w:rtl w:val="0"/>
+              </w:rPr>
+              <w:t xml:space="preserve">The error does not show up, but the user is stopped.</w:t>
             </w:r>
           </w:p>
         </w:tc>
@@ -1940,6 +1903,36 @@
         </w:tc>
       </w:tr>
     </w:tbl>
+    <w:p>
+      <w:pPr>
+        <w:rPr/>
+      </w:pPr>
+      <w:r>
+        <w:rPr>
+          <w:rtl w:val="0"/>
+        </w:rPr>
+      </w:r>
+    </w:p>
+    <w:p>
+      <w:pPr>
+        <w:rPr/>
+      </w:pPr>
+      <w:r>
+        <w:rPr>
+          <w:rtl w:val="0"/>
+        </w:rPr>
+      </w:r>
+    </w:p>
+    <w:p>
+      <w:pPr>
+        <w:rPr/>
+      </w:pPr>
+      <w:r>
+        <w:rPr>
+          <w:rtl w:val="0"/>
+        </w:rPr>
+      </w:r>
+    </w:p>
     <w:p>
       <w:pPr>
         <w:rPr/>
@@ -2016,12 +2009,14 @@
           <w:tcPr/>
           <w:p>
             <w:pPr>
-              <w:rPr/>
-            </w:pPr>
-            <w:r>
-              <w:rPr>
-                <w:rtl w:val="0"/>
-              </w:rPr>
+              <w:ind w:left="0" w:firstLine="0"/>
+              <w:rPr/>
+            </w:pPr>
+            <w:r>
+              <w:rPr>
+                <w:rtl w:val="0"/>
+              </w:rPr>
+              <w:t xml:space="preserve">                                                                                   </w:t>
             </w:r>
           </w:p>
           <w:p>
@@ -2032,9 +2027,9 @@
               <w:rPr/>
               <w:drawing>
                 <wp:inline distB="114300" distT="114300" distL="114300" distR="114300">
-                  <wp:extent cx="857250" cy="352425"/>
+                  <wp:extent cx="3781425" cy="1457325"/>
                   <wp:effectExtent b="0" l="0" r="0" t="0"/>
-                  <wp:docPr id="1" name="image1.png"/>
+                  <wp:docPr id="2" name="image1.png"/>
                   <a:graphic>
                     <a:graphicData uri="http://schemas.openxmlformats.org/drawingml/2006/picture">
                       <pic:pic>
@@ -2043,7 +2038,7 @@
                           <pic:cNvPicPr preferRelativeResize="0"/>
                         </pic:nvPicPr>
                         <pic:blipFill>
-                          <a:blip r:embed="rId9"/>
+                          <a:blip r:embed="rId8"/>
                           <a:srcRect b="0" l="0" r="0" t="0"/>
                           <a:stretch>
                             <a:fillRect/>
@@ -2052,7 +2047,7 @@
                         <pic:spPr>
                           <a:xfrm>
                             <a:off x="0" y="0"/>
-                            <a:ext cx="857250" cy="352425"/>
+                            <a:ext cx="3781425" cy="1457325"/>
                           </a:xfrm>
                           <a:prstGeom prst="rect"/>
                           <a:ln/>
@@ -2067,37 +2062,49 @@
               <w:rPr>
                 <w:rtl w:val="0"/>
               </w:rPr>
-              <w:t xml:space="preserve">(The user gets logged in so the “Login” button turns into a logout button)</w:t>
-            </w:r>
-          </w:p>
-          <w:p>
-            <w:pPr>
-              <w:rPr/>
-            </w:pPr>
-            <w:r>
-              <w:rPr>
-                <w:rtl w:val="0"/>
-              </w:rPr>
-            </w:r>
-          </w:p>
-          <w:p>
-            <w:pPr>
-              <w:rPr/>
-            </w:pPr>
-            <w:r>
-              <w:rPr>
-                <w:rtl w:val="0"/>
-              </w:rPr>
-            </w:r>
-          </w:p>
-          <w:p>
-            <w:pPr>
-              <w:rPr/>
-            </w:pPr>
-            <w:r>
-              <w:rPr>
-                <w:rtl w:val="0"/>
-              </w:rPr>
+            </w:r>
+          </w:p>
+          <w:p>
+            <w:pPr>
+              <w:rPr/>
+            </w:pPr>
+            <w:r>
+              <w:rPr>
+                <w:rtl w:val="0"/>
+              </w:rPr>
+            </w:r>
+          </w:p>
+          <w:p>
+            <w:pPr>
+              <w:rPr/>
+            </w:pPr>
+            <w:r>
+              <w:rPr>
+                <w:rtl w:val="0"/>
+              </w:rPr>
+            </w:r>
+          </w:p>
+          <w:p>
+            <w:pPr>
+              <w:rPr/>
+            </w:pPr>
+            <w:r>
+              <w:rPr>
+                <w:rtl w:val="0"/>
+              </w:rPr>
+              <w:t xml:space="preserve">The screenshot shows that when the user uses an invalid email (e.g “</w:t>
+            </w:r>
+            <w:r>
+              <w:rPr>
+                <w:rtl w:val="0"/>
+              </w:rPr>
+              <w:t xml:space="preserve">test@Gmail.com</w:t>
+            </w:r>
+            <w:r>
+              <w:rPr>
+                <w:rtl w:val="0"/>
+              </w:rPr>
+              <w:t xml:space="preserve">”) to register, a message pops up saying that there is something wrong with their email.</w:t>
             </w:r>
           </w:p>
         </w:tc>

</xml_diff>